<commit_message>
Update AdvMemTest to 0.1.7.582 (Free binaries + manuals + README)
- binaries/advmemtest-free.efi  v0.1.7.free.582 (1,587,296 B, sha256 d6c55b24...)
- iso/ + zip: 0.1.7.582+20261006_132914 (built from build 582 pack, all gates green)
- docs/manual: free guide / quick guide / 34 screenshots / iso readme refreshed
- README: version/release/download updated; self-relocation wording corrected

Co-Authored-By: Claude Code <noreply@anthropic.com>
</commit_message>
<xml_diff>
--- a/AdvMemTest/docs/manual/advmemtest-free-user-guide.docx
+++ b/AdvMemTest/docs/manual/advmemtest-free-user-guide.docx
@@ -230,7 +230,7 @@
         <w:rPr>
           <w:rFonts w:ascii="Arial" w:eastAsia="微软雅黑"/>
         </w:rPr>
-        <w:t xml:space="preserve">advmemtest 解决的核心问题，是把"内存有没有坏、坏在哪"这两件事同时回答清楚。传统内存测试工具（以 Memtest86 系为代表）能回答"有没有坏"，却只给一个裸地址——对"整根替换"的维修流程够用，对"精确到芯片"的更换决策不够（把错误指认到芯片、把坏页清单交出去的能力在专业版，见第七章）。免费版承担经典测试集的全部任务：地址、数据线、电荷保持与缓存干扰类故障的检测不需要任何授权；配合自我重定位让覆盖完整、多核真实并发（上限 16 核）让筛选变快。此外，电荷保持类隐性故障的检测，装机验收时的多核总线争抢类故障暴露，以及测试记录的存档流转，都在它的能力范围之内。</w:t>
+        <w:t xml:space="preserve">advmemtest 解决的核心问题，是把"内存有没有坏、坏在哪"这两件事同时回答清楚。传统内存测试工具（以 Memtest86 系为代表）能回答"有没有坏"，却只给一个裸地址——对"整根替换"的维修流程够用，对"精确到芯片"的更换决策不够（把错误指认到芯片、把坏页清单交出去的能力在专业版，见第七章）。免费版承担经典测试集的全部任务：地址、数据线、电荷保持与缓存干扰类故障的检测不需要任何授权；配合自我重定位（固定 64KB 自管新栈、栈水位遥测）让运行栈稳定可观测，多核真实并发（上限 16 核）让筛选变快。此外，电荷保持类隐性故障的检测，装机验收时的多核总线争抢类故障暴露，以及测试记录的存档流转，都在它的能力范围之内。</w:t>
       </w:r>
     </w:p>
     <w:p>
@@ -3547,7 +3547,7 @@
         <w:rPr>
           <w:rFonts w:ascii="Arial" w:eastAsia="微软雅黑"/>
         </w:rPr>
-        <w:t xml:space="preserve">"运行中 = 暂停"那道护栏，测试跑着也能一步到位；这一层的保护由确认框自身承担：正文明确提示"测试进度将丢失"，并附"退出后请断电重启"的平台提示。换句话说，运行中退出是</w:t>
+        <w:t xml:space="preserve">"运行中 = 暂停"那道护栏，测试跑着也能一步到位；这一层的保护由确认框自身承担：正文明确提示"测试进度将丢失"，并附"退出后回到固件引导流程；若控制台无响应请断电重启"的提示。换句话说，运行中退出是</w:t>
       </w:r>
       <w:r>
         <w:rPr>
@@ -7119,7 +7119,35 @@
         <w:rPr>
           <w:rFonts w:ascii="Arial" w:eastAsia="微软雅黑"/>
         </w:rPr>
-        <w:t xml:space="preserve">所有内存测试软件都有一个天然盲区：程序自己占用的内存不在测试范围内。advmemtest 的自我重定位把这个盲区也填上了。启动后它先分配一块新内存，把自身镜像整体搬移过去，再释放原区域——原先被自己占用的地址段就此纳入测试。搬移过程在串口输出一行（</w:t>
+        <w:t xml:space="preserve">所有内存测试软件都有一个天然盲区：程序自己占用的内存不在测试范围内——advmemtest 不改变这个前提（工具自身占用不参与测试，与同类工具一致），它做的是把</w:t>
+      </w:r>
+      <w:r>
+        <w:rPr>
+          <w:rFonts w:ascii="Arial" w:eastAsia="微软雅黑"/>
+          <w:b/>
+          <w:bCs/>
+        </w:rPr>
+        <w:t xml:space="preserve">自管部分的运行状态</w:t>
+      </w:r>
+      <w:r>
+        <w:rPr>
+          <w:rFonts w:ascii="Arial" w:eastAsia="微软雅黑"/>
+        </w:rPr>
+        <w:t xml:space="preserve">变成可观测。启动时它把自身 PE 镜像整体搬移到高端空闲区、按重定位表修正所有绝对地址，并换到一块</w:t>
+      </w:r>
+      <w:r>
+        <w:rPr>
+          <w:rFonts w:ascii="Arial" w:eastAsia="微软雅黑"/>
+          <w:b/>
+          <w:bCs/>
+        </w:rPr>
+        <w:t xml:space="preserve">固定的 64KB 自管新栈</w:t>
+      </w:r>
+      <w:r>
+        <w:rPr>
+          <w:rFonts w:ascii="Arial" w:eastAsia="微软雅黑"/>
+        </w:rPr>
+        <w:t xml:space="preserve">继续运行——搬移过程在串口输出一行（</w:t>
       </w:r>
       <w:r>
         <w:rPr>
@@ -7131,7 +7159,59 @@
         <w:rPr>
           <w:rFonts w:ascii="Arial" w:eastAsia="微软雅黑"/>
         </w:rPr>
-        <w:t xml:space="preserve">，N 为修正条数），并附带更换新的执行栈；测试期间自身处于新区，原区被压测时不会影响执行。边界情形：当整机可分配内存低于 4MB 时放弃重定位（设计降级，测试照常）。</w:t>
+        <w:t xml:space="preserve">，N 为修正条数），此后每次退出都会扫描新栈并给出水位读数（</w:t>
+      </w:r>
+      <w:r>
+        <w:rPr>
+          <w:rFonts w:ascii="Arial" w:eastAsia="微软雅黑"/>
+        </w:rPr>
+        <w:t xml:space="preserve">stack: … used=n/65536</w:t>
+      </w:r>
+      <w:r>
+        <w:rPr>
+          <w:rFonts w:ascii="Arial" w:eastAsia="微软雅黑"/>
+        </w:rPr>
+        <w:t xml:space="preserve">），</w:t>
+      </w:r>
+      <w:r>
+        <w:rPr>
+          <w:rFonts w:ascii="Arial" w:eastAsia="微软雅黑"/>
+          <w:b/>
+          <w:bCs/>
+        </w:rPr>
+        <w:t xml:space="preserve">栈溢出可见</w:t>
+      </w:r>
+      <w:r>
+        <w:rPr>
+          <w:rFonts w:ascii="Arial" w:eastAsia="微软雅黑"/>
+        </w:rPr>
+        <w:t xml:space="preserve">。</w:t>
+      </w:r>
+      <w:r>
+        <w:rPr>
+          <w:rFonts w:ascii="Arial" w:eastAsia="微软雅黑"/>
+          <w:b/>
+          <w:bCs/>
+        </w:rPr>
+        <w:t xml:space="preserve">原镜像区保留不释放</w:t>
+      </w:r>
+      <w:r>
+        <w:rPr>
+          <w:rFonts w:ascii="Arial" w:eastAsia="微软雅黑"/>
+        </w:rPr>
+        <w:t xml:space="preserve">（串口另有一行 </w:t>
+      </w:r>
+      <w:r>
+        <w:rPr>
+          <w:rFonts w:ascii="Arial" w:eastAsia="微软雅黑"/>
+        </w:rPr>
+        <w:t xml:space="preserve">old-region-kept: 0x... pages=N</w:t>
+      </w:r>
+      <w:r>
+        <w:rPr>
+          <w:rFonts w:ascii="Arial" w:eastAsia="微软雅黑"/>
+        </w:rPr>
+        <w:t xml:space="preserve">）：该区属固件装载器（DxeCore/Shell）所有——固件在卸载镜像时仍要读它（DEBUG 固件会打印镜像的 PDB 调试信息）并负责回收，工具提前释放，固件就会读到已销毁的内容、回收时又对同一段二次释放，真机上表现为退出时乱码后串口静默/挂死（2026-10-05 真机反馈修复，此前版本有此缺陷）。边界情形：当整机可分配内存低于 4MB 时放弃重定位（设计降级，测试照常）。</w:t>
       </w:r>
     </w:p>
     <w:p>
@@ -7291,7 +7371,119 @@
         <w:rPr>
           <w:rFonts w:ascii="Arial" w:eastAsia="微软雅黑"/>
         </w:rPr>
-        <w:t xml:space="preserve">（文本格式，一行一个设置）。下次启动自动读取：文件存在且内容正确时恢复到上次设置，文件缺失、损坏或卷不支持写入（当前 UEFI 文件协议仅支持 FAT 系卷）时回退到默认值——设置保存失败不影响正常使用，仅在串口以 WARN 提醒。配置文件里属于未授权能力的项（锁定 pattern 位、缓存旁路位、注入位）会被免费版忽略并在串口以 WARN 提醒，不会污染本版行为；配置文件里游离在能力之外的模式取值（如顺序轮巡 / 轮流）会被</w:t>
+        <w:t xml:space="preserve">（文本格式，一行一个设置）。下次启动自动读取：文件存在且内容正确时恢复到上次设置，文件缺失、损坏或卷不支持写入（当前 UEFI 文件协议仅支持 FAT 系卷）时回退到默认值——设置保存失败不影响正常使用，仅在串口以 WARN 提醒。配置文件里属于未授权能力的项（锁定 pattern 位、缓存旁路位、注入位）会被免费版忽略并在串口以 WARN 提醒，不会污染本版行为；</w:t>
+      </w:r>
+      <w:r>
+        <w:rPr>
+          <w:rFonts w:ascii="Arial" w:eastAsia="微软雅黑"/>
+          <w:b/>
+          <w:bCs/>
+        </w:rPr>
+        <w:t xml:space="preserve">本版新增的平台探针开关 `map.probe` 同理被忽略</w:t>
+      </w:r>
+      <w:r>
+        <w:rPr>
+          <w:rFonts w:ascii="Arial" w:eastAsia="微软雅黑"/>
+        </w:rPr>
+        <w:t xml:space="preserve">——探针与定位数据同属专业版域，免费版没有它们（写 </w:t>
+      </w:r>
+      <w:r>
+        <w:rPr>
+          <w:rFonts w:ascii="Arial" w:eastAsia="微软雅黑"/>
+        </w:rPr>
+        <w:t xml:space="preserve">map.probe=0</w:t>
+      </w:r>
+      <w:r>
+        <w:rPr>
+          <w:rFonts w:ascii="Arial" w:eastAsia="微软雅黑"/>
+        </w:rPr>
+        <w:t xml:space="preserve"> 时串口留一行 </w:t>
+      </w:r>
+      <w:r>
+        <w:rPr>
+          <w:rFonts w:ascii="Arial" w:eastAsia="微软雅黑"/>
+        </w:rPr>
+        <w:t xml:space="preserve">[AdvMemTest] map.probe setting ignored (Free build)</w:t>
+      </w:r>
+      <w:r>
+        <w:rPr>
+          <w:rFonts w:ascii="Arial" w:eastAsia="微软雅黑"/>
+        </w:rPr>
+        <w:t xml:space="preserve">；同族参数 </w:t>
+      </w:r>
+      <w:r>
+        <w:rPr>
+          <w:rFonts w:ascii="Arial" w:eastAsia="微软雅黑"/>
+        </w:rPr>
+        <w:t xml:space="preserve">mapprobe</w:t>
+      </w:r>
+      <w:r>
+        <w:rPr>
+          <w:rFonts w:ascii="Arial" w:eastAsia="微软雅黑"/>
+        </w:rPr>
+        <w:t xml:space="preserve"> / </w:t>
+      </w:r>
+      <w:r>
+        <w:rPr>
+          <w:rFonts w:ascii="Arial" w:eastAsia="微软雅黑"/>
+        </w:rPr>
+        <w:t xml:space="preserve">-map-mock=</w:t>
+      </w:r>
+      <w:r>
+        <w:rPr>
+          <w:rFonts w:ascii="Arial" w:eastAsia="微软雅黑"/>
+        </w:rPr>
+        <w:t xml:space="preserve"> 也各只留一行带前缀的忽略提示）。</w:t>
+      </w:r>
+      <w:r>
+        <w:rPr>
+          <w:rFonts w:ascii="Arial" w:eastAsia="微软雅黑"/>
+          <w:b/>
+          <w:bCs/>
+        </w:rPr>
+        <w:t xml:space="preserve">免费版的串口里恒不出现以 `map ` 开头的行</w:t>
+      </w:r>
+      <w:r>
+        <w:rPr>
+          <w:rFonts w:ascii="Arial" w:eastAsia="微软雅黑"/>
+        </w:rPr>
+        <w:t xml:space="preserve">——拿免费版跑上述任何参数，找不到专业版手册里那些 </w:t>
+      </w:r>
+      <w:r>
+        <w:rPr>
+          <w:rFonts w:ascii="Arial" w:eastAsia="微软雅黑"/>
+        </w:rPr>
+        <w:t xml:space="preserve">map proto:</w:t>
+      </w:r>
+      <w:r>
+        <w:rPr>
+          <w:rFonts w:ascii="Arial" w:eastAsia="微软雅黑"/>
+        </w:rPr>
+        <w:t xml:space="preserve"> / </w:t>
+      </w:r>
+      <w:r>
+        <w:rPr>
+          <w:rFonts w:ascii="Arial" w:eastAsia="微软雅黑"/>
+        </w:rPr>
+        <w:t xml:space="preserve">map probe:</w:t>
+      </w:r>
+      <w:r>
+        <w:rPr>
+          <w:rFonts w:ascii="Arial" w:eastAsia="微软雅黑"/>
+        </w:rPr>
+        <w:t xml:space="preserve"> / </w:t>
+      </w:r>
+      <w:r>
+        <w:rPr>
+          <w:rFonts w:ascii="Arial" w:eastAsia="微软雅黑"/>
+        </w:rPr>
+        <w:t xml:space="preserve">map verdict:</w:t>
+      </w:r>
+      <w:r>
+        <w:rPr>
+          <w:rFonts w:ascii="Arial" w:eastAsia="微软雅黑"/>
+        </w:rPr>
+        <w:t xml:space="preserve"> 行是设计如此，不是故障；配置文件里游离在能力之外的模式取值（如顺序轮巡 / 轮流）会被</w:t>
       </w:r>
       <w:r>
         <w:rPr>
@@ -8073,7 +8265,7 @@
         <w:rPr>
           <w:rFonts w:ascii="Arial" w:eastAsia="微软雅黑"/>
         </w:rPr>
-        <w:t xml:space="preserve"> 因为固件头部预留了 128MB 不纳入测试，加上固件自身占用的区域，可测内存与物理内存存在固定差值。这是 UEFI 应用的根本约束——被测内存必须向固件申请，测完归还；工具自己占用的区域（重定位后为新区）也计入差值。可测比例在测试中不变化，真实比例以实测为准。</w:t>
+        <w:t xml:space="preserve"> 因为固件头部预留了 128MB 不纳入测试，加上固件自身占用的区域，可测内存与物理内存存在固定差值。这是 UEFI 应用的根本约束——被测内存必须向固件申请，测完归还；工具自己占用的内存（重定位后的新镜像区，以及保留在固件装载器名下的原镜像区）同样不参与测试。可测比例在测试中不变化，真实比例以实测为准。</w:t>
       </w:r>
     </w:p>
     <w:p>

</xml_diff>